<commit_message>
Fill Zerde AI-idioms project with the student's experiment results
Rewrites the paper around the collected data (ChatGPT, DeepSeek,
Gemini; 182 answers): results, discussion, conclusions, annotation,
example table and full answer tables in appendix B. Research diary,
supervisor review, AI declaration and ethics sheet now reflect the
actual work. The workbook is rebuilt from the student's file with
charts; corrections are recorded in tuzetuler.json.

Co-Authored-By: Claude Opus 5.5 <noreply@anthropic.com>
Claude-Session: https://claude.ai/code/session_01GWp2V469ega9rMmDw4DHEN
</commit_message>
<xml_diff>
--- a/Zerde_ZhI_frazeologizm/Etika_paragy.docx
+++ b/Zerde_ZhI_frazeologizm/Etika_paragy.docx
@@ -68,23 +68,6 @@
         <w:t xml:space="preserve">Жобаның тақырыбы: «ЖИ қазақтың тұрақты тіркестерін қалай түсіндіреді?»</w:t>
       </w:r>
     </w:p>
-    <w:p>
-      <w:pPr>
-        <w:spacing w:after="120" w:before="60" w:line="276"/>
-        <w:jc w:val="both"/>
-      </w:pPr>
-      <w:r>
-        <w:rPr>
-          <w:rFonts w:ascii="Times New Roman" w:cs="Times New Roman" w:eastAsia="Times New Roman" w:hAnsi="Times New Roman"/>
-          <w:b w:val="false"/>
-          <w:bCs w:val="false"/>
-          <w:sz w:val="22"/>
-          <w:szCs w:val="22"/>
-          <w:highlight w:val="yellow"/>
-        </w:rPr>
-        <w:t xml:space="preserve">НҰСҚАУ (тапсыру алдында өшіріледі): Белгілерді жұмысыңыздың шын жағдайына қарай тексеріңіз. Жадынама бойынша сыныптастарыңыздан пікір жинасаңыз, 2-тармақ «Иә» болады және ата-ана келісімі қажет.</w:t>
-      </w:r>
-    </w:p>
     <w:tbl>
       <w:tblPr>
         <w:tblW w:type="dxa" w:w="9071"/>
@@ -1230,7 +1213,7 @@
                 <w:sz w:val="22"/>
                 <w:szCs w:val="22"/>
               </w:rPr>
-              <w:t xml:space="preserve">Скриншоттар мен диаграммалар – автордың өзі жасаған; дереккөздерге сілтеме берілді</w:t>
+              <w:t xml:space="preserve">Кестелер мен диаграммалар автордың өз деректері бойынша жасалған; дереккөздерге сілтеме берілді</w:t>
             </w:r>
           </w:p>
         </w:tc>
@@ -1371,7 +1354,7 @@
                 <w:sz w:val="22"/>
                 <w:szCs w:val="22"/>
               </w:rPr>
-              <w:t xml:space="preserve">Күнделік; Tazhiribe_kestesi.xlsx; скриншоттар</w:t>
+              <w:t xml:space="preserve">Зерттеу күнделігі; тәжірибе кестесі (Tazhiribe_kestesi.xlsx)</w:t>
             </w:r>
           </w:p>
         </w:tc>

</xml_diff>